<commit_message>
Entrega 2: estructura de BBDD y módulos del sistema
</commit_message>
<xml_diff>
--- a/estructura-bd-gestor-torneos-giuliano-daniela.docx
+++ b/estructura-bd-gestor-torneos-giuliano-daniela.docx
@@ -4708,17 +4708,16 @@
                 <w:sz w:val="20"/>
                 <w:szCs w:val="22"/>
               </w:rPr>
-              <w:t xml:space="preserve">Segundo competidor (Visitante). Es NULL en rondas futuras </w:t>
-            </w:r>
-            <w:r>
-              <w:rPr>
-                <w:rFonts w:ascii="Arial" w:hAnsi="Arial" w:cs="Arial"/>
-                <w:color w:val="1F1F1F"/>
-                <w:sz w:val="20"/>
-                <w:szCs w:val="22"/>
-                <w:highlight w:val="yellow"/>
-              </w:rPr>
-              <w:t>o en caso de Byes (Pase Libre).</w:t>
+              <w:t xml:space="preserve">Segundo competidor (Visitante). Es NULL en rondas </w:t>
+            </w:r>
+            <w:r>
+              <w:rPr>
+                <w:rFonts w:ascii="Arial" w:hAnsi="Arial" w:cs="Arial"/>
+                <w:color w:val="1F1F1F"/>
+                <w:sz w:val="20"/>
+                <w:szCs w:val="22"/>
+              </w:rPr>
+              <w:t>futuras o en caso de Byes (Pase Libre).</w:t>
             </w:r>
           </w:p>
         </w:tc>
@@ -5006,7 +5005,18 @@
                 <w:sz w:val="20"/>
                 <w:szCs w:val="22"/>
               </w:rPr>
-              <w:t>Etapa dentro de la fase (fecha_1, octavos, cuartos, semifinal, final) para renderizar y agrupar visualmente la grilla o el bracket.</w:t>
+              <w:t>Etapa dentro de la f</w:t>
+            </w:r>
+            <w:bookmarkStart w:id="0" w:name="_GoBack"/>
+            <w:bookmarkEnd w:id="0"/>
+            <w:r>
+              <w:rPr>
+                <w:rFonts w:ascii="Arial" w:hAnsi="Arial" w:cs="Arial"/>
+                <w:color w:val="1F1F1F"/>
+                <w:sz w:val="20"/>
+                <w:szCs w:val="22"/>
+              </w:rPr>
+              <w:t>ase (fecha_1, octavos, cuartos, semifinal, final) para renderizar y agrupar visualmente la grilla o el bracket.</w:t>
             </w:r>
           </w:p>
         </w:tc>
@@ -5541,8 +5551,6 @@
         </w:numPr>
         <w:spacing w:after="120"/>
       </w:pPr>
-      <w:bookmarkStart w:id="0" w:name="_GoBack"/>
-      <w:bookmarkEnd w:id="0"/>
       <w:r>
         <w:t>La cantidad de grupos y la cantidad de clasificados por grupo deben ser potencias de 2, para que el total de clasificados a playoffs también lo sea y no haya que resolver un bye entre grupos distintos.</w:t>
       </w:r>
@@ -16374,7 +16382,7 @@
 </file>
 
 <file path=customXml/itemProps1.xml><?xml version="1.0" encoding="utf-8"?>
-<ds:datastoreItem xmlns:ds="http://schemas.openxmlformats.org/officeDocument/2006/customXml" ds:itemID="{8B73E2FB-EC58-44F5-AA99-5C510AB13842}">
+<ds:datastoreItem xmlns:ds="http://schemas.openxmlformats.org/officeDocument/2006/customXml" ds:itemID="{F7A85B9D-029B-4160-BA71-F998402B6EEC}">
   <ds:schemaRefs>
     <ds:schemaRef ds:uri="http://schemas.openxmlformats.org/officeDocument/2006/bibliography"/>
   </ds:schemaRefs>

</xml_diff>